<commit_message>
Update documentation: timer feature and icon redesign
- Section 4.2: 10s timer rules, color progression, timeout handling
- Section 3 / file table: updated icon descriptions
- Section 7.4: added --clr and --pct dynamic CSS variables
- Appendix 10.2: added 추가 9 (timer) and 추가 10 (icon redesign)
- Regenerated 상식퀴즈_게임_개발문서.docx

Co-Authored-By: Claude Sonnet 4.6 <noreply@anthropic.com>
</commit_message>
<xml_diff>
--- a/상식퀴즈_게임_개발문서.docx
+++ b/상식퀴즈_게임_개발문서.docx
@@ -2929,7 +2929,7 @@
                 <w:sz w:val="20"/>
                 <w:szCs w:val="20"/>
               </w:rPr>
-              <w:t xml:space="preserve">PWA 홈 화면 아이콘 (192×192)</w:t>
+              <w:t xml:space="preserve">PWA 홈 화면 아이콘 (192×192) — 흰색 "?" + 파란 그라데이션 배경</w:t>
             </w:r>
           </w:p>
         </w:tc>
@@ -2987,7 +2987,7 @@
                 <w:sz w:val="20"/>
                 <w:szCs w:val="20"/>
               </w:rPr>
-              <w:t xml:space="preserve">PWA 스플래시/스토어 아이콘 (512×512)</w:t>
+              <w:t xml:space="preserve">PWA 스플래시/스토어 아이콘 (512×512) — 동일 디자인</w:t>
             </w:r>
           </w:p>
         </w:tc>
@@ -3045,7 +3045,7 @@
                 <w:sz w:val="20"/>
                 <w:szCs w:val="20"/>
               </w:rPr>
-              <w:t xml:space="preserve">PNG 아이콘 생성 스크립트 (Node.js, 외부 의존성 없음)</w:t>
+              <w:t xml:space="preserve">PNG 아이콘 생성 스크립트 (Node.js, SDF 선 기반 렌더링으로 "?" 마크 생성)</w:t>
             </w:r>
           </w:p>
         </w:tc>
@@ -3716,7 +3716,7 @@
           <w:sz w:val="22"/>
           <w:szCs w:val="22"/>
         </w:rPr>
-        <w:t xml:space="preserve">Fisher-Yates 셔플로 매 세션 무작위 문제·보기 순서</w:t>
+        <w:t xml:space="preserve">문제당 10초 제한 시간 타이머: 원형 링 카운트다운 (10→0초)</w:t>
       </w:r>
     </w:p>
     <w:p>
@@ -3734,7 +3734,7 @@
           <w:sz w:val="22"/>
           <w:szCs w:val="22"/>
         </w:rPr>
-        <w:t xml:space="preserve">정답 선택 → 즉시 정답/오답 색상 표시 + 출처 안내</w:t>
+        <w:t xml:space="preserve">타이머 색상 변화: 초록(7초 이상) → 노랑(4~6초) → 빨강(3초 이하)</w:t>
       </w:r>
     </w:p>
     <w:p>
@@ -3752,7 +3752,7 @@
           <w:sz w:val="22"/>
           <w:szCs w:val="22"/>
         </w:rPr>
-        <w:t xml:space="preserve">정답 시: 0.5초 후 자동으로 다음 문제 이동</w:t>
+        <w:t xml:space="preserve">시간 초과 시 오답 처리: 정답 하이라이트 + "⏰ 시간 초과!" 피드백 표시</w:t>
       </w:r>
     </w:p>
     <w:p>
@@ -3770,7 +3770,61 @@
           <w:sz w:val="22"/>
           <w:szCs w:val="22"/>
         </w:rPr>
-        <w:t xml:space="preserve">오답 시: "다음 문제 →" 버튼으로 수동 진행</w:t>
+        <w:t xml:space="preserve">Fisher-Yates 셔플로 매 세션 무작위 문제·보기 순서</w:t>
+      </w:r>
+    </w:p>
+    <w:p>
+      <w:pPr>
+        <w:pStyle w:val="ListParagraph"/>
+        <w:numPr>
+          <w:ilvl w:val="0"/>
+          <w:numId w:val="2"/>
+        </w:numPr>
+        <w:spacing w:after="40" w:before="40"/>
+      </w:pPr>
+      <w:r>
+        <w:rPr>
+          <w:color w:val="334155"/>
+          <w:sz w:val="22"/>
+          <w:szCs w:val="22"/>
+        </w:rPr>
+        <w:t xml:space="preserve">정답 선택 → 즉시 정답/오답 색상 표시 + 출처 안내</w:t>
+      </w:r>
+    </w:p>
+    <w:p>
+      <w:pPr>
+        <w:pStyle w:val="ListParagraph"/>
+        <w:numPr>
+          <w:ilvl w:val="0"/>
+          <w:numId w:val="2"/>
+        </w:numPr>
+        <w:spacing w:after="40" w:before="40"/>
+      </w:pPr>
+      <w:r>
+        <w:rPr>
+          <w:color w:val="334155"/>
+          <w:sz w:val="22"/>
+          <w:szCs w:val="22"/>
+        </w:rPr>
+        <w:t xml:space="preserve">정답 시: 0.5초 후 자동으로 다음 문제 이동</w:t>
+      </w:r>
+    </w:p>
+    <w:p>
+      <w:pPr>
+        <w:pStyle w:val="ListParagraph"/>
+        <w:numPr>
+          <w:ilvl w:val="0"/>
+          <w:numId w:val="2"/>
+        </w:numPr>
+        <w:spacing w:after="40" w:before="40"/>
+      </w:pPr>
+      <w:r>
+        <w:rPr>
+          <w:color w:val="334155"/>
+          <w:sz w:val="22"/>
+          <w:szCs w:val="22"/>
+        </w:rPr>
+        <w:t xml:space="preserve">오답/시간 초과 시: "다음 문제 →" 버튼으로 수동 진행</w:t>
       </w:r>
     </w:p>
     <w:p>
@@ -8579,6 +8633,178 @@
                 <w:sz w:val="20"/>
                 <w:szCs w:val="20"/>
               </w:rPr>
+              <w:t xml:space="preserve">--clr (동적)</w:t>
+            </w:r>
+          </w:p>
+        </w:tc>
+        <w:tc>
+          <w:tcPr>
+            <w:tcW w:type="dxa" w:w="1680"/>
+            <w:tcBorders>
+              <w:top w:val="single" w:color="E2E8F0" w:sz="1"/>
+              <w:left w:val="single" w:color="E2E8F0" w:sz="1"/>
+              <w:bottom w:val="single" w:color="E2E8F0" w:sz="1"/>
+              <w:right w:val="single" w:color="E2E8F0" w:sz="1"/>
+            </w:tcBorders>
+            <w:shd w:fill="F8FAFC" w:val="clear"/>
+            <w:tcMar>
+              <w:top w:type="dxa" w:w="80"/>
+              <w:left w:type="dxa" w:w="160"/>
+              <w:bottom w:type="dxa" w:w="80"/>
+              <w:right w:type="dxa" w:w="160"/>
+            </w:tcMar>
+          </w:tcPr>
+          <w:p>
+            <w:r>
+              <w:rPr>
+                <w:color w:val="334155"/>
+                <w:sz w:val="20"/>
+                <w:szCs w:val="20"/>
+              </w:rPr>
+              <w:t xml:space="preserve">#22C55E → #EF4444</w:t>
+            </w:r>
+          </w:p>
+        </w:tc>
+        <w:tc>
+          <w:tcPr>
+            <w:tcW w:type="dxa" w:w="4800"/>
+            <w:tcBorders>
+              <w:top w:val="single" w:color="E2E8F0" w:sz="1"/>
+              <w:left w:val="single" w:color="E2E8F0" w:sz="1"/>
+              <w:bottom w:val="single" w:color="E2E8F0" w:sz="1"/>
+              <w:right w:val="single" w:color="E2E8F0" w:sz="1"/>
+            </w:tcBorders>
+            <w:shd w:fill="F8FAFC" w:val="clear"/>
+            <w:tcMar>
+              <w:top w:type="dxa" w:w="80"/>
+              <w:left w:type="dxa" w:w="160"/>
+              <w:bottom w:type="dxa" w:w="80"/>
+              <w:right w:type="dxa" w:w="160"/>
+            </w:tcMar>
+          </w:tcPr>
+          <w:p>
+            <w:r>
+              <w:rPr>
+                <w:color w:val="334155"/>
+                <w:sz w:val="20"/>
+                <w:szCs w:val="20"/>
+              </w:rPr>
+              <w:t xml:space="preserve">타이머 링 색상 (JavaScript가 인라인으로 갱신)</w:t>
+            </w:r>
+          </w:p>
+        </w:tc>
+      </w:tr>
+      <w:tr>
+        <w:tc>
+          <w:tcPr>
+            <w:tcW w:type="dxa" w:w="2880"/>
+            <w:tcBorders>
+              <w:top w:val="single" w:color="E2E8F0" w:sz="1"/>
+              <w:left w:val="single" w:color="E2E8F0" w:sz="1"/>
+              <w:bottom w:val="single" w:color="E2E8F0" w:sz="1"/>
+              <w:right w:val="single" w:color="E2E8F0" w:sz="1"/>
+            </w:tcBorders>
+            <w:shd w:fill="FFFFFF" w:val="clear"/>
+            <w:tcMar>
+              <w:top w:type="dxa" w:w="80"/>
+              <w:left w:type="dxa" w:w="160"/>
+              <w:bottom w:type="dxa" w:w="80"/>
+              <w:right w:type="dxa" w:w="160"/>
+            </w:tcMar>
+          </w:tcPr>
+          <w:p>
+            <w:r>
+              <w:rPr>
+                <w:color w:val="334155"/>
+                <w:sz w:val="20"/>
+                <w:szCs w:val="20"/>
+              </w:rPr>
+              <w:t xml:space="preserve">--pct (동적)</w:t>
+            </w:r>
+          </w:p>
+        </w:tc>
+        <w:tc>
+          <w:tcPr>
+            <w:tcW w:type="dxa" w:w="1680"/>
+            <w:tcBorders>
+              <w:top w:val="single" w:color="E2E8F0" w:sz="1"/>
+              <w:left w:val="single" w:color="E2E8F0" w:sz="1"/>
+              <w:bottom w:val="single" w:color="E2E8F0" w:sz="1"/>
+              <w:right w:val="single" w:color="E2E8F0" w:sz="1"/>
+            </w:tcBorders>
+            <w:shd w:fill="FFFFFF" w:val="clear"/>
+            <w:tcMar>
+              <w:top w:type="dxa" w:w="80"/>
+              <w:left w:type="dxa" w:w="160"/>
+              <w:bottom w:type="dxa" w:w="80"/>
+              <w:right w:type="dxa" w:w="160"/>
+            </w:tcMar>
+          </w:tcPr>
+          <w:p>
+            <w:r>
+              <w:rPr>
+                <w:color w:val="334155"/>
+                <w:sz w:val="20"/>
+                <w:szCs w:val="20"/>
+              </w:rPr>
+              <w:t xml:space="preserve">100% → 0%</w:t>
+            </w:r>
+          </w:p>
+        </w:tc>
+        <w:tc>
+          <w:tcPr>
+            <w:tcW w:type="dxa" w:w="4800"/>
+            <w:tcBorders>
+              <w:top w:val="single" w:color="E2E8F0" w:sz="1"/>
+              <w:left w:val="single" w:color="E2E8F0" w:sz="1"/>
+              <w:bottom w:val="single" w:color="E2E8F0" w:sz="1"/>
+              <w:right w:val="single" w:color="E2E8F0" w:sz="1"/>
+            </w:tcBorders>
+            <w:shd w:fill="FFFFFF" w:val="clear"/>
+            <w:tcMar>
+              <w:top w:type="dxa" w:w="80"/>
+              <w:left w:type="dxa" w:w="160"/>
+              <w:bottom w:type="dxa" w:w="80"/>
+              <w:right w:type="dxa" w:w="160"/>
+            </w:tcMar>
+          </w:tcPr>
+          <w:p>
+            <w:r>
+              <w:rPr>
+                <w:color w:val="334155"/>
+                <w:sz w:val="20"/>
+                <w:szCs w:val="20"/>
+              </w:rPr>
+              <w:t xml:space="preserve">타이머 링 conic-gradient 진행률</w:t>
+            </w:r>
+          </w:p>
+        </w:tc>
+      </w:tr>
+      <w:tr>
+        <w:tc>
+          <w:tcPr>
+            <w:tcW w:type="dxa" w:w="2880"/>
+            <w:tcBorders>
+              <w:top w:val="single" w:color="E2E8F0" w:sz="1"/>
+              <w:left w:val="single" w:color="E2E8F0" w:sz="1"/>
+              <w:bottom w:val="single" w:color="E2E8F0" w:sz="1"/>
+              <w:right w:val="single" w:color="E2E8F0" w:sz="1"/>
+            </w:tcBorders>
+            <w:shd w:fill="F8FAFC" w:val="clear"/>
+            <w:tcMar>
+              <w:top w:type="dxa" w:w="80"/>
+              <w:left w:type="dxa" w:w="160"/>
+              <w:bottom w:type="dxa" w:w="80"/>
+              <w:right w:type="dxa" w:w="160"/>
+            </w:tcMar>
+          </w:tcPr>
+          <w:p>
+            <w:r>
+              <w:rPr>
+                <w:color w:val="334155"/>
+                <w:sz w:val="20"/>
+                <w:szCs w:val="20"/>
+              </w:rPr>
               <w:t xml:space="preserve">--touch-min</w:t>
             </w:r>
           </w:p>
@@ -11506,6 +11732,122 @@
                 <w:szCs w:val="20"/>
               </w:rPr>
               <w:t xml:space="preserve">PWA 지원: manifest.json, sw.js, 앱 아이콘(192/512px), 오프라인 캐싱</w:t>
+            </w:r>
+          </w:p>
+        </w:tc>
+      </w:tr>
+      <w:tr>
+        <w:tc>
+          <w:tcPr>
+            <w:tcW w:type="dxa" w:w="1440"/>
+            <w:tcBorders>
+              <w:top w:val="single" w:color="E2E8F0" w:sz="1"/>
+              <w:left w:val="single" w:color="E2E8F0" w:sz="1"/>
+              <w:bottom w:val="single" w:color="E2E8F0" w:sz="1"/>
+              <w:right w:val="single" w:color="E2E8F0" w:sz="1"/>
+            </w:tcBorders>
+            <w:shd w:fill="F8FAFC" w:val="clear"/>
+            <w:tcMar>
+              <w:top w:type="dxa" w:w="80"/>
+              <w:left w:type="dxa" w:w="160"/>
+              <w:bottom w:type="dxa" w:w="80"/>
+              <w:right w:type="dxa" w:w="160"/>
+            </w:tcMar>
+          </w:tcPr>
+          <w:p>
+            <w:r>
+              <w:rPr>
+                <w:color w:val="334155"/>
+                <w:sz w:val="20"/>
+                <w:szCs w:val="20"/>
+              </w:rPr>
+              <w:t xml:space="preserve">추가 9</w:t>
+            </w:r>
+          </w:p>
+        </w:tc>
+        <w:tc>
+          <w:tcPr>
+            <w:tcW w:type="dxa" w:w="7920"/>
+            <w:tcBorders>
+              <w:top w:val="single" w:color="E2E8F0" w:sz="1"/>
+              <w:left w:val="single" w:color="E2E8F0" w:sz="1"/>
+              <w:bottom w:val="single" w:color="E2E8F0" w:sz="1"/>
+              <w:right w:val="single" w:color="E2E8F0" w:sz="1"/>
+            </w:tcBorders>
+            <w:shd w:fill="F8FAFC" w:val="clear"/>
+            <w:tcMar>
+              <w:top w:type="dxa" w:w="80"/>
+              <w:left w:type="dxa" w:w="160"/>
+              <w:bottom w:type="dxa" w:w="80"/>
+              <w:right w:type="dxa" w:w="160"/>
+            </w:tcMar>
+          </w:tcPr>
+          <w:p>
+            <w:r>
+              <w:rPr>
+                <w:color w:val="334155"/>
+                <w:sz w:val="20"/>
+                <w:szCs w:val="20"/>
+              </w:rPr>
+              <w:t xml:space="preserve">문제당 10초 제한 타이머: 원형 링 UI, 색상 경보, 시간 초과 오답 처리</w:t>
+            </w:r>
+          </w:p>
+        </w:tc>
+      </w:tr>
+      <w:tr>
+        <w:tc>
+          <w:tcPr>
+            <w:tcW w:type="dxa" w:w="1440"/>
+            <w:tcBorders>
+              <w:top w:val="single" w:color="E2E8F0" w:sz="1"/>
+              <w:left w:val="single" w:color="E2E8F0" w:sz="1"/>
+              <w:bottom w:val="single" w:color="E2E8F0" w:sz="1"/>
+              <w:right w:val="single" w:color="E2E8F0" w:sz="1"/>
+            </w:tcBorders>
+            <w:shd w:fill="FFFFFF" w:val="clear"/>
+            <w:tcMar>
+              <w:top w:type="dxa" w:w="80"/>
+              <w:left w:type="dxa" w:w="160"/>
+              <w:bottom w:type="dxa" w:w="80"/>
+              <w:right w:type="dxa" w:w="160"/>
+            </w:tcMar>
+          </w:tcPr>
+          <w:p>
+            <w:r>
+              <w:rPr>
+                <w:color w:val="334155"/>
+                <w:sz w:val="20"/>
+                <w:szCs w:val="20"/>
+              </w:rPr>
+              <w:t xml:space="preserve">추가 10</w:t>
+            </w:r>
+          </w:p>
+        </w:tc>
+        <w:tc>
+          <w:tcPr>
+            <w:tcW w:type="dxa" w:w="7920"/>
+            <w:tcBorders>
+              <w:top w:val="single" w:color="E2E8F0" w:sz="1"/>
+              <w:left w:val="single" w:color="E2E8F0" w:sz="1"/>
+              <w:bottom w:val="single" w:color="E2E8F0" w:sz="1"/>
+              <w:right w:val="single" w:color="E2E8F0" w:sz="1"/>
+            </w:tcBorders>
+            <w:shd w:fill="FFFFFF" w:val="clear"/>
+            <w:tcMar>
+              <w:top w:type="dxa" w:w="80"/>
+              <w:left w:type="dxa" w:w="160"/>
+              <w:bottom w:type="dxa" w:w="80"/>
+              <w:right w:type="dxa" w:w="160"/>
+            </w:tcMar>
+          </w:tcPr>
+          <w:p>
+            <w:r>
+              <w:rPr>
+                <w:color w:val="334155"/>
+                <w:sz w:val="20"/>
+                <w:szCs w:val="20"/>
+              </w:rPr>
+              <w:t xml:space="preserve">PWA 아이콘 재디자인: 흰색 "?" + 파란 그라데이션 (SDF 선 기반 픽셀 렌더링)</w:t>
             </w:r>
           </w:p>
         </w:tc>

</xml_diff>